<commit_message>
Update field pkm skema
</commit_message>
<xml_diff>
--- a/ai/model/tests/file_target.docx
+++ b/ai/model/tests/file_target.docx
@@ -6814,16 +6814,19 @@
     <w:p>
       <w:pPr>
         <w:pStyle w:val="Judul1"/>
+        <w:spacing w:line="360" w:lineRule="auto"/>
         <w:rPr>
           <w:rFonts w:cs="Times New Roman"/>
-          <w:szCs w:val="24"/>
+          <w:sz w:val="28"/>
+          <w:szCs w:val="28"/>
         </w:rPr>
       </w:pPr>
       <w:bookmarkStart w:id="20" w:name="_Toc229820729"/>
       <w:r>
         <w:rPr>
           <w:rFonts w:cs="Times New Roman"/>
-          <w:szCs w:val="24"/>
+          <w:sz w:val="28"/>
+          <w:szCs w:val="28"/>
         </w:rPr>
         <w:lastRenderedPageBreak/>
         <w:t>BAB 4. BIAYA DAN JADWAL KEGIATAN</w:t>
@@ -6832,7 +6835,8 @@
       <w:r>
         <w:rPr>
           <w:rFonts w:cs="Times New Roman"/>
-          <w:szCs w:val="24"/>
+          <w:sz w:val="28"/>
+          <w:szCs w:val="28"/>
         </w:rPr>
         <w:t xml:space="preserve"> </w:t>
       </w:r>

</xml_diff>